<commit_message>
Clarify grading baseline and input evolution
</commit_message>
<xml_diff>
--- a/releases/v0.3.8/architecture/PRD-Genie-Architecture-Writeup-v0.3.8.docx
+++ b/releases/v0.3.8/architecture/PRD-Genie-Architecture-Writeup-v0.3.8.docx
@@ -29,6 +29,17 @@
     <w:p>
       <w:r>
         <w:t>NeuronForge PMs and TPMs manually reconcile product briefs, meeting transcripts, stakeholder notes, and clarifications before creating PRDs and delivery backlogs. This process is slow, inconsistent, and difficult to audit because evidence, decisions, and downstream artifacts can drift apart. PRD Genie creates a governed path from authoritative evidence to planning-ready documentation while retaining human approval, visible uncertainty, and source-to-delivery traceability.</w:t>
+      </w:r>
+    </w:p>
+    <w:p>
+      <w:r>
+        <w:rPr>
+          <w:b/>
+        </w:rPr>
+        <w:t xml:space="preserve">Input-set evolution: </w:t>
+      </w:r>
+      <w:r>
+        <w:t>three immutable discovery sources were followed by three human-authored clarification records dated August 7, 2026. Formal execution 11901 consumed the resulting six-document approved packet; decision IDs and bounded supersession preserve both original evidence and current governing state.</w:t>
       </w:r>
     </w:p>
     <w:p>
@@ -464,6 +475,17 @@
       </w:r>
       <w:r>
         <w:t>Each stage depends on a validated upstream contract: intake → extraction → gap analysis → human approval → PRD → stories → reconciliation/export. Clarification, rejection, validation failure, and revision stop or redirect the run. Specialized children remain independently testable while one parent run identity connects every source, decision, artifact, evaluation, and delivery event.</w:t>
+      </w:r>
+    </w:p>
+    <w:p>
+      <w:r>
+        <w:rPr>
+          <w:b/>
+        </w:rPr>
+        <w:t xml:space="preserve">Why Gap Analysis immediately follows extraction: </w:t>
+      </w:r>
+      <w:r>
+        <w:t>the Extractor establishes a normalized, citation-linked account of what the evidence says; the Gap Analyzer then tests sufficiency, ambiguity, contradiction, dependencies, risks, and generation readiness before approval or PRD creation. This fail-fast boundary prevents unresolved evidence from becoming polished downstream content and avoids generating artifacts that must later be discarded. Post-generation validators retain separate grounding, structure, coverage, and reconciliation duties.</w:t>
       </w:r>
     </w:p>
     <w:p>

</xml_diff>

<commit_message>
Align architecture metrics and Scope Estimator terminology
</commit_message>
<xml_diff>
--- a/releases/v0.3.8/architecture/PRD-Genie-Architecture-Writeup-v0.3.8.docx
+++ b/releases/v0.3.8/architecture/PRD-Genie-Architecture-Writeup-v0.3.8.docx
@@ -1180,17 +1180,8 @@
             <w:vAlign w:val="center"/>
           </w:tcPr>
           <w:p>
-            <w:pPr>
-              <w:spacing w:after="0" w:line="240" w:lineRule="auto"/>
-            </w:pPr>
             <w:r>
-              <w:rPr>
-                <w:rFonts w:ascii="Aptos" w:hAnsi="Aptos"/>
-                <w:b/>
-                <w:color w:val="19192F"/>
-                <w:sz w:val="14"/>
-              </w:rPr>
-              <w:t>T-shirt Sizing</w:t>
+              <w:t>Scope Estimator</w:t>
             </w:r>
           </w:p>
         </w:tc>
@@ -1207,16 +1198,8 @@
             <w:vAlign w:val="center"/>
           </w:tcPr>
           <w:p>
-            <w:pPr>
-              <w:spacing w:after="0" w:line="240" w:lineRule="auto"/>
-            </w:pPr>
             <w:r>
-              <w:rPr>
-                <w:rFonts w:ascii="Aptos" w:hAnsi="Aptos"/>
-                <w:color w:val="19192F"/>
-                <w:sz w:val="14"/>
-              </w:rPr>
-              <w:t>Stories → advisory sizing</w:t>
+              <w:t>Stories → T-shirt size estimates</w:t>
             </w:r>
           </w:p>
         </w:tc>
@@ -1233,16 +1216,8 @@
             <w:vAlign w:val="center"/>
           </w:tcPr>
           <w:p>
-            <w:pPr>
-              <w:spacing w:after="0" w:line="240" w:lineRule="auto"/>
-            </w:pPr>
             <w:r>
-              <w:rPr>
-                <w:rFonts w:ascii="Aptos" w:hAnsi="Aptos"/>
-                <w:color w:val="19192F"/>
-                <w:sz w:val="14"/>
-              </w:rPr>
-              <w:t>Return size, confidence, and guidance; remain non-blocking and non-committal.</w:t>
+              <w:t>Return advisory size, confidence, and guidance; remain non-blocking and non-committal.</w:t>
             </w:r>
           </w:p>
         </w:tc>
@@ -1289,16 +1264,7 @@
         <w:pStyle w:val="CompactBullet"/>
       </w:pPr>
       <w:r>
-        <w:t xml:space="preserve">• </w:t>
-      </w:r>
-      <w:r>
-        <w:rPr>
-          <w:b/>
-        </w:rPr>
-        <w:t>Accuracy and completeness:</w:t>
-      </w:r>
-      <w:r>
-        <w:t xml:space="preserve"> 100% governed ID reconciliation from source through export, with zero orphaned records.</w:t>
+        <w:t>• Extraction completeness: percentage of stated requirements correctly captured; target 100%, with source-to-export ID reconciliation and zero orphans.</w:t>
       </w:r>
     </w:p>
     <w:p>
@@ -1306,16 +1272,7 @@
         <w:pStyle w:val="CompactBullet"/>
       </w:pPr>
       <w:r>
-        <w:t xml:space="preserve">• </w:t>
-      </w:r>
-      <w:r>
-        <w:rPr>
-          <w:b/>
-        </w:rPr>
-        <w:t>Trustworthiness:</w:t>
-      </w:r>
-      <w:r>
-        <w:t xml:space="preserve"> zero unsupported claims and hallucination ≤ 0.15 at every governed semantic stage.</w:t>
+        <w:t>• Hallucination rate: percentage of PRD items not traceable to approved source material; target zero unsupported claims and stage hallucination ≤ 0.15.</w:t>
       </w:r>
     </w:p>
     <w:p>
@@ -1323,27 +1280,12 @@
         <w:pStyle w:val="CompactBullet"/>
       </w:pPr>
       <w:r>
-        <w:t xml:space="preserve">• </w:t>
-      </w:r>
-      <w:r>
-        <w:rPr>
-          <w:b/>
-        </w:rPr>
-        <w:t>Usefulness and efficiency:</w:t>
-      </w:r>
-      <w:r>
-        <w:t xml:space="preserve"> planning artifacts accepted without rework, reviewer time saved, latency, adoption, and fully loaded cost per run.</w:t>
+        <w:t>• Format compliance: percentage of PRDs following the required ten-section template and passing schema validation; target 100%.</w:t>
       </w:r>
     </w:p>
     <w:p>
       <w:r>
-        <w:rPr>
-          <w:b/>
-        </w:rPr>
-        <w:t xml:space="preserve">Method: </w:t>
-      </w:r>
-      <w:r>
-        <w:t>T1–T12 ground truth; schemas, exact-value and set controls; Langfuse code, faithfulness, hallucination, and sizing-reasonableness evaluators; and a fail-closed Agreement Gate.</w:t>
+        <w:t>Method: T1–T12 ground truth; schema, exact-value, and set controls; Langfuse code, faithfulness, and hallucination evaluators; Scope Estimator reasonableness; and a fail-closed Agreement Gate. Supporting metrics include rework, time saved, latency, adoption, and loaded cost.</w:t>
       </w:r>
     </w:p>
     <w:p>
@@ -1359,10 +1301,7 @@
         <w:pStyle w:val="CompactBullet"/>
       </w:pPr>
       <w:r>
-        <w:t xml:space="preserve">• </w:t>
-      </w:r>
-      <w:r>
-        <w:t>Typed contracts and explicit insufficient-information behavior prevented vague, contradictory, incomplete, and empty inputs from becoming polished unsupported outputs.</w:t>
+        <w:t>• What worked: typed contracts, explicit insufficient-information behavior, human approval, and fail-closed validation prevented unsupported output from reaching delivery.</w:t>
       </w:r>
     </w:p>
     <w:p>
@@ -1370,10 +1309,7 @@
         <w:pStyle w:val="CompactBullet"/>
       </w:pPr>
       <w:r>
-        <w:t xml:space="preserve">• </w:t>
-      </w:r>
-      <w:r>
-        <w:t>Early semantic failures prompted tighter prompts, strict current-trace correlation, and a hold-for-human-review path for incomplete or failing scores.</w:t>
+        <w:t>• Hallucination and fix: T6 incorrectly treated microservices and a single-page application as contradictory. Removing the unsupported contradiction and cross-links while retaining genuine approval, deadline, and scope gaps reduced hallucination from 0.40 to 0.08; code evaluation passed.</w:t>
       </w:r>
     </w:p>
     <w:p>

</xml_diff>